<commit_message>
made additions to the sql database
</commit_message>
<xml_diff>
--- a/docs/SQLDATABASESCRIPT.docx
+++ b/docs/SQLDATABASESCRIPT.docx
@@ -4,7 +4,7 @@
   <w:body>
     <w:p>
       <w:r>
-        <w:t>4. SECTION C – SQL DATABASE SCRIPT</w:t>
+        <w:t>SECTION C – SQL DATABASE SCRIPT</w:t>
       </w:r>
     </w:p>
     <w:p>
@@ -1747,6 +1747,53 @@
             </a:graphic>
           </wp:inline>
         </w:drawing>
+      </w:r>
+    </w:p>
+    <w:p>
+      <w:r>
+        <w:lastRenderedPageBreak/>
+        <w:t>DATABASE DESIGN SUMMARY</w:t>
+      </w:r>
+    </w:p>
+    <w:p>
+      <w:r>
+        <w:t xml:space="preserve">The </w:t>
+      </w:r>
+      <w:proofErr w:type="spellStart"/>
+      <w:r>
+        <w:t>RaceDay</w:t>
+      </w:r>
+      <w:proofErr w:type="spellEnd"/>
+      <w:r>
+        <w:t xml:space="preserve"> database was designed around six entities.</w:t>
+      </w:r>
+    </w:p>
+    <w:p>
+      <w:r>
+        <w:t>The Roles entity controls the available system roles. The Users entity stores the registered Organisers and Participants. Organisers are linked to events through the Events entity.</w:t>
+      </w:r>
+    </w:p>
+    <w:p>
+      <w:r>
+        <w:t>Each event can contain multiple categories through the Categories entity. Participants enter events through the Enrolments entity, which links a Participant to an Event and selected Category.</w:t>
+      </w:r>
+    </w:p>
+    <w:p>
+      <w:r>
+        <w:t>After an event has taken place, an Organiser can record a Participant's finishing time and position using the Results entity.</w:t>
+      </w:r>
+    </w:p>
+    <w:p>
+      <w:r>
+        <w:t xml:space="preserve">This relational structure reduces unnecessary duplication and provides clear relationships between users, events, categories, </w:t>
+      </w:r>
+      <w:proofErr w:type="gramStart"/>
+      <w:r>
+        <w:t>enrolments</w:t>
+      </w:r>
+      <w:proofErr w:type="gramEnd"/>
+      <w:r>
+        <w:t xml:space="preserve"> and results.</w:t>
       </w:r>
     </w:p>
     <w:sectPr>

</xml_diff>